<commit_message>
Passage panel practice worksheet: landscape
Co-Authored-By: Claude Fable 5.1 <noreply@anthropic.com>
Claude-Session: https://claude.ai/code/session_019gyiige9BuJUj3e3kcjvaS
</commit_message>
<xml_diff>
--- a/curious-incident/files/Curious Incident Speaking Folio - Lesson 3a - Passage Panel Practice.docx
+++ b/curious-incident/files/Curious Incident Speaking Folio - Lesson 3a - Passage Panel Practice.docx
@@ -484,7 +484,7 @@
               </w:rPr>
               <w:t xml:space="preserve">Open </w:t>
             </w:r>
-            <w:hyperlink w:history="1" r:id="rId-bytpwbjddmrrajcl7uuy">
+            <w:hyperlink w:history="1" r:id="rIdp6nxqiwjtat59ykf8lsx4">
               <w:r>
                 <w:rPr>
                   <w:rFonts w:ascii="Calibri" w:cs="Calibri" w:eastAsia="Calibri" w:hAnsi="Calibri"/>
@@ -835,7 +835,7 @@
               </w:numPr>
               <w:spacing w:after="30"/>
             </w:pPr>
-            <w:hyperlink w:history="1" r:id="rIdgehxqfztgdeip0aqsj8xn">
+            <w:hyperlink w:history="1" r:id="rIdanolkcizagvnqyazshjbf">
               <w:r>
                 <w:rPr>
                   <w:rFonts w:ascii="Calibri" w:cs="Calibri" w:eastAsia="Calibri" w:hAnsi="Calibri"/>
@@ -873,7 +873,7 @@
               </w:rPr>
               <w:t xml:space="preserve">TV: </w:t>
             </w:r>
-            <w:hyperlink w:history="1" r:id="rId5lta60uemni1dpldgfhfr">
+            <w:hyperlink w:history="1" r:id="rIdrcnqusj_7p4qwsoqwri9a">
               <w:r>
                 <w:rPr>
                   <w:rFonts w:ascii="Calibri" w:cs="Calibri" w:eastAsia="Calibri" w:hAnsi="Calibri"/>
@@ -911,7 +911,7 @@
               </w:rPr>
               <w:t xml:space="preserve">Words: </w:t>
             </w:r>
-            <w:hyperlink w:history="1" r:id="rIdosnpvt9ag1dqmxndooimq">
+            <w:hyperlink w:history="1" r:id="rIdz7uliywgi5_yltd_f00fx">
               <w:r>
                 <w:rPr>
                   <w:rFonts w:ascii="Calibri" w:cs="Calibri" w:eastAsia="Calibri" w:hAnsi="Calibri"/>

</xml_diff>